<commit_message>
Refresh docs for current waypoint workflow
Updates README and docs to describe the current three-waypoint experiment, ROS/Gazebo startup flow, logging outputs, and the distinction between control odometry and evaluation ground truth. Adds targeted docstrings/comments across controller, navigation, localization, config, and helper scripts to clarify behavior without changing core logic, translates Round_Robot and startup script notes to English, and includes a temporary Word lock file (`~$Report.docx`).
</commit_message>
<xml_diff>
--- a/Report.docx
+++ b/Report.docx
@@ -72,10 +72,21 @@
       </w:r>
       <w:proofErr w:type="spellEnd"/>
       <w:r>
-        <w:t>, read from /</w:t>
+        <w:t xml:space="preserve">, read from </w:t>
+      </w:r>
+      <w:r>
+        <w:rPr>
+          <w:i/>
+          <w:iCs/>
+        </w:rPr>
+        <w:t>/</w:t>
       </w:r>
       <w:proofErr w:type="spellStart"/>
       <w:r>
+        <w:rPr>
+          <w:i/>
+          <w:iCs/>
+        </w:rPr>
         <w:t>joint_states</w:t>
       </w:r>
       <w:proofErr w:type="spellEnd"/>
@@ -906,12 +917,22 @@
         <w:rPr>
           <w:rFonts w:hint="eastAsia"/>
         </w:rPr>
-        <w:t>Gazebo publishes an independent true pose on /</w:t>
-      </w:r>
-      <w:proofErr w:type="spellStart"/>
+        <w:t xml:space="preserve">Gazebo publishes an independent true pose on </w:t>
+      </w:r>
       <w:r>
         <w:rPr>
           <w:rFonts w:hint="eastAsia"/>
+          <w:i/>
+          <w:iCs/>
+        </w:rPr>
+        <w:t>/</w:t>
+      </w:r>
+      <w:proofErr w:type="spellStart"/>
+      <w:r>
+        <w:rPr>
+          <w:rFonts w:hint="eastAsia"/>
+          <w:i/>
+          <w:iCs/>
         </w:rPr>
         <w:t>ground_truth</w:t>
       </w:r>
@@ -932,12 +953,22 @@
         <w:rPr>
           <w:rFonts w:hint="eastAsia"/>
         </w:rPr>
-        <w:t xml:space="preserve"> 0.10 s; ground truth is used solely for evaluation. Waypoint navigation separately uses /</w:t>
-      </w:r>
-      <w:proofErr w:type="spellStart"/>
+        <w:t xml:space="preserve"> 0.10 s; ground truth is used solely for evaluation. Waypoint navigation separately uses </w:t>
+      </w:r>
       <w:r>
         <w:rPr>
           <w:rFonts w:hint="eastAsia"/>
+          <w:i/>
+          <w:iCs/>
+        </w:rPr>
+        <w:t>/</w:t>
+      </w:r>
+      <w:proofErr w:type="spellStart"/>
+      <w:r>
+        <w:rPr>
+          <w:rFonts w:hint="eastAsia"/>
+          <w:i/>
+          <w:iCs/>
         </w:rPr>
         <w:t>odom</w:t>
       </w:r>
@@ -1411,7 +1442,7 @@
     </w:p>
     <w:sectPr>
       <w:pgSz w:w="12240" w:h="15840"/>
-      <w:pgMar w:top="1440" w:right="1440" w:bottom="1440" w:left="1440" w:header="720" w:footer="720" w:gutter="0"/>
+      <w:pgMar w:top="1021" w:right="1134" w:bottom="1021" w:left="1134" w:header="720" w:footer="720" w:gutter="0"/>
       <w:cols w:space="720"/>
       <w:docGrid w:linePitch="360"/>
     </w:sectPr>
@@ -2060,6 +2091,7 @@
   <w:style w:type="character" w:default="1" w:styleId="a0">
     <w:name w:val="Default Paragraph Font"/>
     <w:uiPriority w:val="1"/>
+    <w:semiHidden/>
     <w:unhideWhenUsed/>
   </w:style>
   <w:style w:type="table" w:default="1" w:styleId="a1">

</xml_diff>